<commit_message>
upload slides session 10
</commit_message>
<xml_diff>
--- a/docs/problem_sets/01-solution.docx
+++ b/docs/problem_sets/01-solution.docx
@@ -7,19 +7,7 @@
         <w:pStyle w:val="Title"/>
       </w:pPr>
       <w:r>
-        <w:t xml:space="preserve">Problem</w:t>
-      </w:r>
-      <w:r>
-        <w:t xml:space="preserve"> </w:t>
-      </w:r>
-      <w:r>
-        <w:t xml:space="preserve">set</w:t>
-      </w:r>
-      <w:r>
-        <w:t xml:space="preserve"> </w:t>
-      </w:r>
-      <w:r>
-        <w:t xml:space="preserve">1</w:t>
+        <w:t xml:space="preserve">Problem set 1</w:t>
       </w:r>
     </w:p>
     <w:p>
@@ -27,25 +15,7 @@
         <w:pStyle w:val="Author"/>
       </w:pPr>
       <w:r>
-        <w:t xml:space="preserve">Put</w:t>
-      </w:r>
-      <w:r>
-        <w:t xml:space="preserve"> </w:t>
-      </w:r>
-      <w:r>
-        <w:t xml:space="preserve">your</w:t>
-      </w:r>
-      <w:r>
-        <w:t xml:space="preserve"> </w:t>
-      </w:r>
-      <w:r>
-        <w:t xml:space="preserve">name</w:t>
-      </w:r>
-      <w:r>
-        <w:t xml:space="preserve"> </w:t>
-      </w:r>
-      <w:r>
-        <w:t xml:space="preserve">here</w:t>
+        <w:t xml:space="preserve">Put your name here</w:t>
       </w:r>
     </w:p>
     <w:sdt>
@@ -61,19 +31,7 @@
             <w:pStyle w:val="TOCHeading"/>
           </w:pPr>
           <w:r>
-            <w:t xml:space="preserve">Table</w:t>
-          </w:r>
-          <w:r>
-            <w:t xml:space="preserve"> </w:t>
-          </w:r>
-          <w:r>
-            <w:t xml:space="preserve">of</w:t>
-          </w:r>
-          <w:r>
-            <w:t xml:space="preserve"> </w:t>
-          </w:r>
-          <w:r>
-            <w:t xml:space="preserve">contents</w:t>
+            <w:t xml:space="preserve">Table of contents</w:t>
           </w:r>
         </w:p>
         <w:p>
@@ -237,13 +195,7 @@
         <w:t xml:space="preserve">data into R. Make sure to use the correct path (</w:t>
       </w:r>
       <w:r>
-        <w:t xml:space="preserve">“</w:t>
-      </w:r>
-      <w:r>
-        <w:t xml:space="preserve">data/cars.csv</w:t>
-      </w:r>
-      <w:r>
-        <w:t xml:space="preserve">”</w:t>
+        <w:t xml:space="preserve">“data/cars.csv”</w:t>
       </w:r>
       <w:r>
         <w:t xml:space="preserve">). Name the data frame</w:t>
@@ -252,13 +204,7 @@
         <w:t xml:space="preserve"> </w:t>
       </w:r>
       <w:r>
-        <w:t xml:space="preserve">“</w:t>
-      </w:r>
-      <w:r>
-        <w:t xml:space="preserve">cars</w:t>
-      </w:r>
-      <w:r>
-        <w:t xml:space="preserve">”</w:t>
+        <w:t xml:space="preserve">“cars”</w:t>
       </w:r>
       <w:r>
         <w:t xml:space="preserve"> </w:t>
@@ -513,13 +459,7 @@
         <w:t xml:space="preserve"> </w:t>
       </w:r>
       <w:r>
-        <w:t xml:space="preserve">“</w:t>
-      </w:r>
-      <w:r>
-        <w:t xml:space="preserve">honda</w:t>
-      </w:r>
-      <w:r>
-        <w:t xml:space="preserve">”</w:t>
+        <w:t xml:space="preserve">“honda”</w:t>
       </w:r>
       <w:r>
         <w:t xml:space="preserve"> </w:t>
@@ -531,13 +471,7 @@
         <w:t xml:space="preserve"> </w:t>
       </w:r>
       <w:r>
-        <w:t xml:space="preserve">“</w:t>
-      </w:r>
-      <w:r>
-        <w:t xml:space="preserve">honda_data</w:t>
-      </w:r>
-      <w:r>
-        <w:t xml:space="preserve">”</w:t>
+        <w:t xml:space="preserve">“honda_data”</w:t>
       </w:r>
       <w:r>
         <w:t xml:space="preserve"> </w:t>
@@ -773,13 +707,7 @@
         <w:t xml:space="preserve"> </w:t>
       </w:r>
       <w:r>
-        <w:t xml:space="preserve">“</w:t>
-      </w:r>
-      <w:r>
-        <w:t xml:space="preserve">cars</w:t>
-      </w:r>
-      <w:r>
-        <w:t xml:space="preserve">”</w:t>
+        <w:t xml:space="preserve">“cars”</w:t>
       </w:r>
       <w:r>
         <w:t xml:space="preserve"> </w:t>
@@ -1061,7 +989,7 @@
   </w:style>
   <w:style w:styleId="Subtitle" w:type="paragraph">
     <w:name w:val="Subtitle"/>
-    <w:basedOn w:val="Normal"/>
+    <w:basedOn w:val="Title"/>
     <w:next w:val="BodyText"/>
     <w:link w:val="SubtitleChar"/>
     <w:uiPriority w:val="11"/>
@@ -1074,7 +1002,6 @@
     </w:pPr>
     <w:rPr>
       <w:rFonts w:cstheme="majorBidi" w:eastAsiaTheme="majorEastAsia"/>
-      <w:color w:themeColor="text1" w:themeTint="A6" w:val="595959"/>
       <w:spacing w:val="15"/>
       <w:sz w:val="28"/>
       <w:szCs w:val="28"/>
@@ -1127,7 +1054,6 @@
     </w:pPr>
     <w:rPr>
       <w:b/>
-      <w:color w:val="345A8A"/>
       <w:sz w:val="20"/>
       <w:szCs w:val="20"/>
     </w:rPr>

</xml_diff>